<commit_message>
docs: update contribution table to credit Challenge 2/3B evidence and OpenAPI contributions
</commit_message>
<xml_diff>
--- a/docs/report/Assignment1_Design_and_Technical_Report.docx
+++ b/docs/report/Assignment1_Design_and_Technical_Report.docx
@@ -6809,7 +6809,7 @@
               <w:rPr>
                 <w:sz w:val="18"/>
               </w:rPr>
-              <w:t>Seat service (BR1, BR2); Challenge 1 evidence</w:t>
+              <w:t>Seat service (BR1, BR2); Challenge 1 evidence; Challenge 3B seat-side evidence; seat-service OpenAPI spec</w:t>
             </w:r>
           </w:p>
         </w:tc>
@@ -6850,7 +6850,7 @@
               <w:rPr>
                 <w:sz w:val="18"/>
               </w:rPr>
-              <w:t>Booking service (BR3, BR4 booking-side, state machine, orchestration); e2e test script; design notes</w:t>
+              <w:t>Booking service (BR3, BR4 booking-side, state machine, orchestration); e2e test script; Challenge 3B booking-side evidence; design notes</w:t>
             </w:r>
           </w:p>
         </w:tc>
@@ -6891,7 +6891,7 @@
               <w:rPr>
                 <w:sz w:val="18"/>
               </w:rPr>
-              <w:t>Payment service (BR4 payment-side)</w:t>
+              <w:t>Payment service (BR4 payment-side); Challenge 2 evidence; payment-service OpenAPI spec</w:t>
             </w:r>
           </w:p>
         </w:tc>

</xml_diff>

<commit_message>
report: add Krishna Sagar's individual reflection and AI-use declaration
</commit_message>
<xml_diff>
--- a/docs/report/Assignment1_Design_and_Technical_Report.docx
+++ b/docs/report/Assignment1_Design_and_Technical_Report.docx
@@ -6929,6 +6929,24 @@
       </w:r>
     </w:p>
     <w:p>
+      <w:r>
+        <w:rPr>
+          <w:i/>
+          <w:color w:val="C00000"/>
+        </w:rPr>
+        <w:t>Krishna Sagar – Notification Service, diagrams, and report: My main contribution was building the notification service, which records a confirmation every time a booking is paid successfully, and verifying the mock payment gateway's ok/down/slow modes that the rest of the team relies on for testing failure handling. Beyond my own service, I worked on merging all four branches into main, re-running the full test suite and the end-to-end script after each merge, and fixing a real defect in payment-service that only showed up once the system was tested end to end: a gateway-down failure was being cached as a permanent result against the Idempotency-Key, so a retry after the gateway recovered kept replaying the stale failure instead of succeeding. I also produced the architecture, sequence, state-machine and ER diagrams, and drafted the design and technical report, consolidating the evidence each teammate produced for their own engineering challenge.</w:t>
+      </w:r>
+    </w:p>
+    <w:p>
+      <w:r>
+        <w:rPr>
+          <w:i/>
+          <w:color w:val="C00000"/>
+        </w:rPr>
+        <w:t>The most challenging part was diagnosing that idempotency bug - it never showed up in any single service's unit tests, only once all five services were run together under a real failure-then-recovery scenario, which reinforced for me why integration testing across service boundaries matters as much as unit testing within one service. If I were to improve this further, I would add a scheduled job to clean up abandoned idempotency keys left by crashed requests, and I would push for every service to expose its own OpenAPI spec and Dockerfile earlier in the process, since reconciling those at the end took more coordination than it should have.</w:t>
+      </w:r>
+    </w:p>
+    <w:p>
       <w:pPr>
         <w:pStyle w:val="Heading2"/>
       </w:pPr>
@@ -6943,6 +6961,15 @@
           <w:color w:val="C00000"/>
         </w:rPr>
         <w:t>[PLACEHOLDER - Declare which AI tools were used and for what, per team member, e.g.: 'Used an AI coding assistant for exploring the codebase, drafting code, generating diagrams, and drafting report sections. All generated content was reviewed, tested, and run before being committed.' Each member who used AI tools should add their own specific declaration.]</w:t>
+      </w:r>
+    </w:p>
+    <w:p>
+      <w:r>
+        <w:rPr>
+          <w:i/>
+          <w:color w:val="C00000"/>
+        </w:rPr>
+        <w:t>Krishna Sagar - Used AI coding assistants (Claude and OpenCode) for exploring the existing codebase and scaffold, drafting the notification-service implementation and its tests, diagnosing the cross-service idempotency defect in payment-service described above, generating the architecture, sequence, state-machine and ER diagrams, and drafting sections of this design and technical report. All generated code, diagrams and report content were reviewed, tested, and verified against the running system before being committed or included.</w:t>
       </w:r>
     </w:p>
     <w:sectPr>

</xml_diff>